<commit_message>
updated the validation report document
</commit_message>
<xml_diff>
--- a/Evidence/[Validation] Distinguish async validation failures from invalid values.docx
+++ b/Evidence/[Validation] Distinguish async validation failures from invalid values.docx
@@ -88,7 +88,14 @@
           <w:b/>
           <w:bCs/>
         </w:rPr>
-        <w:t>Sample application:</w:t>
+        <w:t>Application</w:t>
+      </w:r>
+      <w:r>
+        <w:rPr>
+          <w:b/>
+          <w:bCs/>
+        </w:rPr>
+        <w:t>:</w:t>
       </w:r>
       <w:r>
         <w:rPr>
@@ -105,6 +112,26 @@
           <w:t>Validation69530</w:t>
         </w:r>
       </w:hyperlink>
+      <w:r>
+        <w:t xml:space="preserve"> (</w:t>
+      </w:r>
+      <w:r>
+        <w:t>B</w:t>
+      </w:r>
+      <w:r>
+        <w:t xml:space="preserve">oth Interactive Server and Interactive </w:t>
+      </w:r>
+      <w:proofErr w:type="spellStart"/>
+      <w:r>
+        <w:t>WebAssembly</w:t>
+      </w:r>
+      <w:proofErr w:type="spellEnd"/>
+      <w:r>
+        <w:t xml:space="preserve"> are tested in this app on separate pages using render modes.</w:t>
+      </w:r>
+      <w:r>
+        <w:t>)</w:t>
+      </w:r>
     </w:p>
     <w:p>
       <w:r>
@@ -120,6 +147,43 @@
       <w:r>
         <w:t>All scenarios are works as expected.</w:t>
       </w:r>
+    </w:p>
+    <w:p>
+      <w:r>
+        <w:rPr>
+          <w:b/>
+          <w:bCs/>
+        </w:rPr>
+        <w:t>Build:</w:t>
+      </w:r>
+      <w:r>
+        <w:t xml:space="preserve"> 0 Errors, 0 warnings</w:t>
+      </w:r>
+    </w:p>
+    <w:p>
+      <w:pPr>
+        <w:rPr>
+          <w:b/>
+          <w:bCs/>
+        </w:rPr>
+      </w:pPr>
+      <w:r>
+        <w:rPr>
+          <w:b/>
+          <w:bCs/>
+        </w:rPr>
+        <w:t xml:space="preserve">Repository link: </w:t>
+      </w:r>
+      <w:hyperlink r:id="rId7" w:history="1">
+        <w:r>
+          <w:rPr>
+            <w:rStyle w:val="Hyperlink"/>
+            <w:b/>
+            <w:bCs/>
+          </w:rPr>
+          <w:t>https://github.com/karmegams02/form-async-validation-evidence</w:t>
+        </w:r>
+      </w:hyperlink>
     </w:p>
     <w:p/>
     <w:p>
@@ -170,7 +234,6 @@
           </w:tcPr>
           <w:p>
             <w:proofErr w:type="spellStart"/>
-            <w:proofErr w:type="gramStart"/>
             <w:r>
               <w:rPr>
                 <w:b/>
@@ -179,7 +242,6 @@
               <w:t>S.No</w:t>
             </w:r>
             <w:proofErr w:type="spellEnd"/>
-            <w:proofErr w:type="gramEnd"/>
           </w:p>
         </w:tc>
         <w:tc>
@@ -323,12 +385,12 @@
             <w:hideMark/>
           </w:tcPr>
           <w:p>
-            <w:hyperlink r:id="rId7" w:history="1">
+            <w:hyperlink r:id="rId8" w:history="1">
               <w:r>
                 <w:rPr>
                   <w:rStyle w:val="Hyperlink"/>
                 </w:rPr>
-                <w:t>taken-ordinary-validation-message.png</w:t>
+                <w:t>server/taken-ordinary-validation-message.png</w:t>
               </w:r>
             </w:hyperlink>
           </w:p>
@@ -345,12 +407,20 @@
             <w:hideMark/>
           </w:tcPr>
           <w:p>
-            <w:hyperlink r:id="rId8" w:history="1">
+            <w:hyperlink r:id="rId9" w:history="1">
+              <w:proofErr w:type="spellStart"/>
               <w:r>
                 <w:rPr>
                   <w:rStyle w:val="Hyperlink"/>
                 </w:rPr>
-                <w:t>taken-ordinary-validation-message.png</w:t>
+                <w:t>wasm</w:t>
+              </w:r>
+              <w:proofErr w:type="spellEnd"/>
+              <w:r>
+                <w:rPr>
+                  <w:rStyle w:val="Hyperlink"/>
+                </w:rPr>
+                <w:t>/taken-ordinary-validation-message.png</w:t>
               </w:r>
             </w:hyperlink>
           </w:p>
@@ -420,12 +490,12 @@
             <w:hideMark/>
           </w:tcPr>
           <w:p>
-            <w:hyperlink r:id="rId9" w:history="1">
+            <w:hyperlink r:id="rId10" w:history="1">
               <w:r>
                 <w:rPr>
                   <w:rStyle w:val="Hyperlink"/>
                 </w:rPr>
-                <w:t>Field-faulted-retry-feedback.mp4</w:t>
+                <w:t>server/Field-faulted-retry-feedback.mp4</w:t>
               </w:r>
             </w:hyperlink>
           </w:p>
@@ -442,12 +512,20 @@
             <w:hideMark/>
           </w:tcPr>
           <w:p>
-            <w:hyperlink r:id="rId10" w:history="1">
+            <w:hyperlink r:id="rId11" w:history="1">
+              <w:proofErr w:type="spellStart"/>
               <w:r>
                 <w:rPr>
                   <w:rStyle w:val="Hyperlink"/>
                 </w:rPr>
-                <w:t>Field-faulted-retry-feedback.mp4</w:t>
+                <w:t>wasm</w:t>
+              </w:r>
+              <w:proofErr w:type="spellEnd"/>
+              <w:r>
+                <w:rPr>
+                  <w:rStyle w:val="Hyperlink"/>
+                </w:rPr>
+                <w:t>/Field-faulted-retry-feedback.mp4</w:t>
               </w:r>
             </w:hyperlink>
           </w:p>
@@ -517,12 +595,12 @@
             <w:hideMark/>
           </w:tcPr>
           <w:p>
-            <w:hyperlink r:id="rId11" w:history="1">
+            <w:hyperlink r:id="rId12" w:history="1">
               <w:r>
                 <w:rPr>
                   <w:rStyle w:val="Hyperlink"/>
                 </w:rPr>
-                <w:t>Field-faulted-recovery-test.mp4</w:t>
+                <w:t>server/Field-faulted-recovery-test.mp4</w:t>
               </w:r>
             </w:hyperlink>
           </w:p>
@@ -539,12 +617,20 @@
             <w:hideMark/>
           </w:tcPr>
           <w:p>
-            <w:hyperlink r:id="rId12" w:history="1">
+            <w:hyperlink r:id="rId13" w:history="1">
+              <w:proofErr w:type="spellStart"/>
               <w:r>
                 <w:rPr>
                   <w:rStyle w:val="Hyperlink"/>
                 </w:rPr>
-                <w:t>Field-faulted-recovery-test.mp4</w:t>
+                <w:t>wasm</w:t>
+              </w:r>
+              <w:proofErr w:type="spellEnd"/>
+              <w:r>
+                <w:rPr>
+                  <w:rStyle w:val="Hyperlink"/>
+                </w:rPr>
+                <w:t>/Field-faulted-recovery-test.mp4</w:t>
               </w:r>
             </w:hyperlink>
           </w:p>
@@ -581,6 +667,7 @@
           </w:tcPr>
           <w:p>
             <w:r>
+              <w:lastRenderedPageBreak/>
               <w:t>4</w:t>
             </w:r>
           </w:p>
@@ -630,12 +717,12 @@
             <w:hideMark/>
           </w:tcPr>
           <w:p>
-            <w:hyperlink r:id="rId13" w:history="1">
+            <w:hyperlink r:id="rId14" w:history="1">
               <w:r>
                 <w:rPr>
                   <w:rStyle w:val="Hyperlink"/>
                 </w:rPr>
-                <w:t>submit-failure-invalid-callback.mp4</w:t>
+                <w:t>server/submit-failure-invalid-callback.mp4</w:t>
               </w:r>
             </w:hyperlink>
           </w:p>
@@ -652,12 +739,20 @@
             <w:hideMark/>
           </w:tcPr>
           <w:p>
-            <w:hyperlink r:id="rId14" w:history="1">
+            <w:hyperlink r:id="rId15" w:history="1">
+              <w:proofErr w:type="spellStart"/>
               <w:r>
                 <w:rPr>
                   <w:rStyle w:val="Hyperlink"/>
                 </w:rPr>
-                <w:t>submit-failure-invalid-callback.mp4</w:t>
+                <w:t>wasm</w:t>
+              </w:r>
+              <w:proofErr w:type="spellEnd"/>
+              <w:r>
+                <w:rPr>
+                  <w:rStyle w:val="Hyperlink"/>
+                </w:rPr>
+                <w:t>/submit-failure-invalid-callback.mp4</w:t>
               </w:r>
             </w:hyperlink>
           </w:p>
@@ -694,7 +789,6 @@
           </w:tcPr>
           <w:p>
             <w:r>
-              <w:lastRenderedPageBreak/>
               <w:t>5</w:t>
             </w:r>
           </w:p>
@@ -736,12 +830,12 @@
             <w:hideMark/>
           </w:tcPr>
           <w:p>
-            <w:hyperlink r:id="rId15" w:history="1">
+            <w:hyperlink r:id="rId16" w:history="1">
               <w:r>
                 <w:rPr>
                   <w:rStyle w:val="Hyperlink"/>
                 </w:rPr>
-                <w:t>valid-submit test.mp4</w:t>
+                <w:t>server/valid-submit test.mp4</w:t>
               </w:r>
             </w:hyperlink>
           </w:p>
@@ -758,12 +852,20 @@
             <w:hideMark/>
           </w:tcPr>
           <w:p>
-            <w:hyperlink r:id="rId16" w:history="1">
+            <w:hyperlink r:id="rId17" w:history="1">
+              <w:proofErr w:type="spellStart"/>
               <w:r>
                 <w:rPr>
                   <w:rStyle w:val="Hyperlink"/>
                 </w:rPr>
-                <w:t>valid-submit test.mp4</w:t>
+                <w:t>wasm</w:t>
+              </w:r>
+              <w:proofErr w:type="spellEnd"/>
+              <w:r>
+                <w:rPr>
+                  <w:rStyle w:val="Hyperlink"/>
+                </w:rPr>
+                <w:t>/valid-submit test.mp4</w:t>
               </w:r>
             </w:hyperlink>
           </w:p>

</xml_diff>